<commit_message>
Checkpoint b4 Begin Writing
</commit_message>
<xml_diff>
--- a/Thesis Assets/Thesis Working Draft.docx
+++ b/Thesis Assets/Thesis Working Draft.docx
@@ -2006,19 +2006,13 @@
         <w:t>and as attributed to each of the candidates</w:t>
       </w:r>
       <w:r>
-        <w:t>" (</w:t>
-      </w:r>
-      <w:r>
-        <w:t>Levine et. al</w:t>
+        <w:t>" (Levine et. al</w:t>
       </w:r>
       <w:r>
         <w:t xml:space="preserve">, </w:t>
       </w:r>
       <w:r>
-        <w:t>2001</w:t>
-      </w:r>
-      <w:r>
-        <w:t>).</w:t>
+        <w:t>2001).</w:t>
       </w:r>
       <w:r>
         <w:t xml:space="preserve"> The authors conduct two surveys, one before the 2008 primary election and one shortly before the general election, taking ~800 and ~200 undergraduate students as respondents, respectively</w:t>
@@ -2649,10 +2643,7 @@
         </w:rPr>
       </w:pPr>
       <w:r>
-        <w:t xml:space="preserve">Levine et al. (2001) has a great section on messaging in political campaigns and WHAT </w:t>
-      </w:r>
-      <w:r>
-        <w:t xml:space="preserve">people consider important for voting on (in terms of character </w:t>
+        <w:t xml:space="preserve">Levine et al. (2001) has a great section on messaging in political campaigns and WHAT people consider important for voting on (in terms of character </w:t>
       </w:r>
       <w:proofErr w:type="spellStart"/>
       <w:r>
@@ -2694,14 +2685,7 @@
           <w:i/>
           <w:iCs/>
         </w:rPr>
-        <w:t>"</w:t>
-      </w:r>
-      <w:r>
-        <w:rPr>
-          <w:i/>
-          <w:iCs/>
-        </w:rPr>
-        <w:t xml:space="preserve"> Of course, the party that is not in the White House maybe able to make a stronger case for change, but even the incumbent party—and </w:t>
+        <w:t xml:space="preserve">" Of course, the party that is not in the White House maybe able to make a stronger case for change, but even the incumbent party—and </w:t>
       </w:r>
       <w:proofErr w:type="spellStart"/>
       <w:r>
@@ -2749,26 +2733,166 @@
           <w:i/>
           <w:iCs/>
         </w:rPr>
-        <w:t>Brownstein, 2004).</w:t>
-      </w:r>
-      <w:r>
-        <w:rPr>
-          <w:i/>
-          <w:iCs/>
-        </w:rPr>
-        <w:t xml:space="preserve">" </w:t>
-      </w:r>
-      <w:r>
-        <w:rPr>
-          <w:i/>
-          <w:iCs/>
-        </w:rPr>
-        <w:t>Levine et al. (2001)</w:t>
+        <w:t>Brownstein, 2004)." Levine et al. (2001)</w:t>
       </w:r>
     </w:p>
     <w:p/>
     <w:p>
       <w:pPr>
+        <w:rPr>
+          <w:b/>
+          <w:bCs/>
+          <w:sz w:val="28"/>
+          <w:szCs w:val="28"/>
+        </w:rPr>
+      </w:pPr>
+    </w:p>
+    <w:p>
+      <w:pPr>
+        <w:jc w:val="center"/>
+        <w:rPr>
+          <w:b/>
+          <w:bCs/>
+          <w:sz w:val="28"/>
+          <w:szCs w:val="28"/>
+        </w:rPr>
+      </w:pPr>
+    </w:p>
+    <w:p>
+      <w:pPr>
+        <w:jc w:val="center"/>
+        <w:rPr>
+          <w:b/>
+          <w:bCs/>
+          <w:sz w:val="28"/>
+          <w:szCs w:val="28"/>
+        </w:rPr>
+      </w:pPr>
+    </w:p>
+    <w:p>
+      <w:pPr>
+        <w:jc w:val="center"/>
+        <w:rPr>
+          <w:b/>
+          <w:bCs/>
+          <w:sz w:val="28"/>
+          <w:szCs w:val="28"/>
+        </w:rPr>
+      </w:pPr>
+    </w:p>
+    <w:p>
+      <w:pPr>
+        <w:jc w:val="center"/>
+        <w:rPr>
+          <w:b/>
+          <w:bCs/>
+          <w:sz w:val="28"/>
+          <w:szCs w:val="28"/>
+        </w:rPr>
+      </w:pPr>
+    </w:p>
+    <w:p>
+      <w:pPr>
+        <w:jc w:val="center"/>
+        <w:rPr>
+          <w:b/>
+          <w:bCs/>
+          <w:sz w:val="28"/>
+          <w:szCs w:val="28"/>
+        </w:rPr>
+      </w:pPr>
+    </w:p>
+    <w:p>
+      <w:pPr>
+        <w:jc w:val="center"/>
+        <w:rPr>
+          <w:b/>
+          <w:bCs/>
+          <w:sz w:val="28"/>
+          <w:szCs w:val="28"/>
+        </w:rPr>
+      </w:pPr>
+    </w:p>
+    <w:p>
+      <w:pPr>
+        <w:jc w:val="center"/>
+        <w:rPr>
+          <w:b/>
+          <w:bCs/>
+          <w:sz w:val="28"/>
+          <w:szCs w:val="28"/>
+        </w:rPr>
+      </w:pPr>
+    </w:p>
+    <w:p>
+      <w:pPr>
+        <w:jc w:val="center"/>
+        <w:rPr>
+          <w:b/>
+          <w:bCs/>
+          <w:sz w:val="28"/>
+          <w:szCs w:val="28"/>
+        </w:rPr>
+      </w:pPr>
+    </w:p>
+    <w:p>
+      <w:pPr>
+        <w:jc w:val="center"/>
+        <w:rPr>
+          <w:b/>
+          <w:bCs/>
+          <w:sz w:val="28"/>
+          <w:szCs w:val="28"/>
+        </w:rPr>
+      </w:pPr>
+    </w:p>
+    <w:p>
+      <w:pPr>
+        <w:jc w:val="center"/>
+        <w:rPr>
+          <w:b/>
+          <w:bCs/>
+          <w:sz w:val="28"/>
+          <w:szCs w:val="28"/>
+        </w:rPr>
+      </w:pPr>
+    </w:p>
+    <w:p>
+      <w:pPr>
+        <w:jc w:val="center"/>
+        <w:rPr>
+          <w:b/>
+          <w:bCs/>
+          <w:sz w:val="28"/>
+          <w:szCs w:val="28"/>
+        </w:rPr>
+      </w:pPr>
+    </w:p>
+    <w:p>
+      <w:pPr>
+        <w:jc w:val="center"/>
+        <w:rPr>
+          <w:b/>
+          <w:bCs/>
+          <w:sz w:val="28"/>
+          <w:szCs w:val="28"/>
+        </w:rPr>
+      </w:pPr>
+    </w:p>
+    <w:p>
+      <w:pPr>
+        <w:jc w:val="center"/>
+        <w:rPr>
+          <w:b/>
+          <w:bCs/>
+          <w:sz w:val="28"/>
+          <w:szCs w:val="28"/>
+        </w:rPr>
+      </w:pPr>
+    </w:p>
+    <w:p>
+      <w:pPr>
+        <w:jc w:val="center"/>
         <w:rPr>
           <w:b/>
           <w:bCs/>
@@ -3227,7 +3351,13 @@
         <w:t xml:space="preserve">: </w:t>
       </w:r>
       <w:r>
-        <w:t xml:space="preserve">29th </w:t>
+        <w:t>2</w:t>
+      </w:r>
+      <w:r>
+        <w:t>8</w:t>
+      </w:r>
+      <w:r>
+        <w:t xml:space="preserve">th </w:t>
       </w:r>
       <w:r>
         <w:t>April</w:t>

</xml_diff>

<commit_message>
Study 2 Practically done
</commit_message>
<xml_diff>
--- a/Thesis Assets/Thesis Working Draft.docx
+++ b/Thesis Assets/Thesis Working Draft.docx
@@ -112,14 +112,14 @@
           <w:sz w:val="48"/>
           <w:szCs w:val="48"/>
         </w:rPr>
-        <w:t xml:space="preserve">I </w:t>
+        <w:t>Change is the Only Constant</w:t>
       </w:r>
       <w:r>
         <w:rPr>
           <w:sz w:val="48"/>
           <w:szCs w:val="48"/>
         </w:rPr>
-        <w:t>Wish You'd Change:</w:t>
+        <w:t>:</w:t>
       </w:r>
     </w:p>
     <w:p>
@@ -488,7 +488,6 @@
         </w:rPr>
         <w:tab/>
       </w:r>
-      <w:proofErr w:type="gramStart"/>
       <w:r>
         <w:rPr>
           <w:sz w:val="28"/>
@@ -503,13 +502,6 @@
           <w:szCs w:val="28"/>
         </w:rPr>
         <w:tab/>
-      </w:r>
-      <w:proofErr w:type="gramEnd"/>
-      <w:r>
-        <w:rPr>
-          <w:sz w:val="28"/>
-          <w:szCs w:val="28"/>
-        </w:rPr>
         <w:t xml:space="preserve">  </w:t>
       </w:r>
       <w:r>
@@ -799,100 +791,6 @@
         </w:p>
         <w:p>
           <w:pPr>
-            <w:spacing w:line="480" w:lineRule="auto"/>
-            <w:rPr>
-              <w:sz w:val="28"/>
-              <w:szCs w:val="28"/>
-            </w:rPr>
-          </w:pPr>
-          <w:r>
-            <w:rPr>
-              <w:sz w:val="28"/>
-              <w:szCs w:val="28"/>
-            </w:rPr>
-            <w:t>List of Tables</w:t>
-          </w:r>
-          <w:r>
-            <w:rPr>
-              <w:sz w:val="28"/>
-              <w:szCs w:val="28"/>
-            </w:rPr>
-            <w:tab/>
-          </w:r>
-          <w:r>
-            <w:rPr>
-              <w:sz w:val="28"/>
-              <w:szCs w:val="28"/>
-            </w:rPr>
-            <w:tab/>
-          </w:r>
-          <w:r>
-            <w:rPr>
-              <w:sz w:val="28"/>
-              <w:szCs w:val="28"/>
-            </w:rPr>
-            <w:tab/>
-          </w:r>
-          <w:r>
-            <w:rPr>
-              <w:sz w:val="28"/>
-              <w:szCs w:val="28"/>
-            </w:rPr>
-            <w:tab/>
-          </w:r>
-          <w:r>
-            <w:rPr>
-              <w:sz w:val="28"/>
-              <w:szCs w:val="28"/>
-            </w:rPr>
-            <w:tab/>
-          </w:r>
-          <w:r>
-            <w:rPr>
-              <w:sz w:val="28"/>
-              <w:szCs w:val="28"/>
-            </w:rPr>
-            <w:tab/>
-          </w:r>
-          <w:r>
-            <w:rPr>
-              <w:sz w:val="28"/>
-              <w:szCs w:val="28"/>
-            </w:rPr>
-            <w:tab/>
-          </w:r>
-          <w:r>
-            <w:rPr>
-              <w:sz w:val="28"/>
-              <w:szCs w:val="28"/>
-            </w:rPr>
-            <w:tab/>
-          </w:r>
-          <w:r>
-            <w:rPr>
-              <w:sz w:val="28"/>
-              <w:szCs w:val="28"/>
-            </w:rPr>
-            <w:tab/>
-          </w:r>
-          <w:r>
-            <w:rPr>
-              <w:sz w:val="28"/>
-              <w:szCs w:val="28"/>
-            </w:rPr>
-            <w:tab/>
-            <w:t xml:space="preserve">     </w:t>
-          </w:r>
-          <w:r>
-            <w:rPr>
-              <w:sz w:val="28"/>
-              <w:szCs w:val="28"/>
-            </w:rPr>
-            <w:t xml:space="preserve"> iv</w:t>
-          </w:r>
-        </w:p>
-        <w:p>
-          <w:pPr>
             <w:pStyle w:val="TOC1"/>
             <w:spacing w:line="480" w:lineRule="auto"/>
           </w:pPr>
@@ -943,10 +841,7 @@
             <w:spacing w:line="360" w:lineRule="auto"/>
           </w:pPr>
           <w:r>
-            <w:t>Background</w:t>
-          </w:r>
-          <w:r>
-            <w:t xml:space="preserve"> </w:t>
+            <w:t>Introduction</w:t>
           </w:r>
         </w:p>
         <w:p>
@@ -990,7 +885,7 @@
             <w:t xml:space="preserve"> </w:t>
           </w:r>
           <w:r>
-            <w:t>Motivations</w:t>
+            <w:t>Research Question and Motivations</w:t>
           </w:r>
           <w:r>
             <w:t xml:space="preserve"> </w:t>
@@ -1046,7 +941,25 @@
             <w:t xml:space="preserve"> </w:t>
           </w:r>
           <w:r>
-            <w:t>Incumbency (dis)Advantage</w:t>
+            <w:t xml:space="preserve">Candidate </w:t>
+          </w:r>
+          <w:r>
+            <w:t xml:space="preserve">'Change' </w:t>
+          </w:r>
+          <w:r>
+            <w:t>Posturing</w:t>
+          </w:r>
+          <w:r>
+            <w:t xml:space="preserve"> and</w:t>
+          </w:r>
+          <w:r>
+            <w:t xml:space="preserve"> Voter</w:t>
+          </w:r>
+          <w:r>
+            <w:t xml:space="preserve"> Perception</w:t>
+          </w:r>
+          <w:r>
+            <w:t>s</w:t>
           </w:r>
           <w:r>
             <w:t xml:space="preserve"> </w:t>
@@ -1069,45 +982,10 @@
             <w:t>3</w:t>
           </w:r>
           <w:r>
-            <w:t xml:space="preserve"> Candidate </w:t>
-          </w:r>
-          <w:r>
-            <w:t xml:space="preserve">Perceptions </w:t>
-          </w:r>
-          <w:r>
-            <w:t xml:space="preserve">and </w:t>
-          </w:r>
-          <w:r>
-            <w:t>Communication to Electorate</w:t>
-          </w:r>
-          <w:r>
             <w:t xml:space="preserve"> </w:t>
           </w:r>
           <w:r>
-            <w:ptab w:relativeTo="margin" w:alignment="right" w:leader="dot"/>
-          </w:r>
-          <w:r>
-            <w:t xml:space="preserve"> 5</w:t>
-          </w:r>
-        </w:p>
-        <w:p>
-          <w:pPr>
-            <w:pStyle w:val="TOC2"/>
-          </w:pPr>
-          <w:r>
-            <w:t>2.</w:t>
-          </w:r>
-          <w:r>
-            <w:t>4</w:t>
-          </w:r>
-          <w:r>
-            <w:t xml:space="preserve"> Textual Analysis </w:t>
-          </w:r>
-          <w:r>
-            <w:t>in</w:t>
-          </w:r>
-          <w:r>
-            <w:t xml:space="preserve"> Electoral Campaigns </w:t>
+            <w:t xml:space="preserve">Voting for 'Change' </w:t>
           </w:r>
           <w:r>
             <w:ptab w:relativeTo="margin" w:alignment="right" w:leader="dot"/>
@@ -1122,13 +1000,13 @@
             <w:spacing w:line="480" w:lineRule="auto"/>
           </w:pPr>
           <w:r>
-            <w:t>2.</w:t>
-          </w:r>
-          <w:r>
-            <w:t xml:space="preserve">5 </w:t>
-          </w:r>
-          <w:r>
-            <w:t xml:space="preserve">Voter Clustering using Data Science Methods </w:t>
+            <w:t>2.4</w:t>
+          </w:r>
+          <w:r>
+            <w:t xml:space="preserve"> Contribution</w:t>
+          </w:r>
+          <w:r>
+            <w:t xml:space="preserve">s </w:t>
           </w:r>
           <w:r>
             <w:ptab w:relativeTo="margin" w:alignment="right" w:leader="dot"/>
@@ -1150,7 +1028,7 @@
               <w:sz w:val="28"/>
               <w:szCs w:val="28"/>
             </w:rPr>
-            <w:t>Research Questions &amp; Contribution</w:t>
+            <w:t>Data</w:t>
           </w:r>
         </w:p>
         <w:p>
@@ -1158,7 +1036,22 @@
             <w:pStyle w:val="TOC2"/>
           </w:pPr>
           <w:r>
-            <w:t xml:space="preserve">3.1 Research Questions </w:t>
+            <w:t>4</w:t>
+          </w:r>
+          <w:r>
+            <w:t xml:space="preserve">.1 </w:t>
+          </w:r>
+          <w:r>
+            <w:t xml:space="preserve">Candidate </w:t>
+          </w:r>
+          <w:r>
+            <w:t xml:space="preserve">Election </w:t>
+          </w:r>
+          <w:r>
+            <w:t>Documents</w:t>
+          </w:r>
+          <w:r>
+            <w:t xml:space="preserve"> </w:t>
           </w:r>
           <w:r>
             <w:ptab w:relativeTo="margin" w:alignment="right" w:leader="dot"/>
@@ -1170,13 +1063,21 @@
         <w:p>
           <w:pPr>
             <w:pStyle w:val="TOC2"/>
-            <w:spacing w:line="480" w:lineRule="auto"/>
           </w:pPr>
           <w:r>
-            <w:t>3.2 Contribution</w:t>
-          </w:r>
-          <w:r>
-            <w:t xml:space="preserve"> to Field</w:t>
+            <w:t>4</w:t>
+          </w:r>
+          <w:r>
+            <w:t>.</w:t>
+          </w:r>
+          <w:r>
+            <w:t>2</w:t>
+          </w:r>
+          <w:r>
+            <w:t xml:space="preserve"> </w:t>
+          </w:r>
+          <w:r>
+            <w:t>Voter Survey Data</w:t>
           </w:r>
           <w:r>
             <w:t xml:space="preserve"> </w:t>
@@ -1201,92 +1102,7 @@
               <w:sz w:val="28"/>
               <w:szCs w:val="28"/>
             </w:rPr>
-            <w:t>Data</w:t>
-          </w:r>
-        </w:p>
-        <w:p>
-          <w:pPr>
-            <w:pStyle w:val="TOC2"/>
-          </w:pPr>
-          <w:r>
-            <w:t>4</w:t>
-          </w:r>
-          <w:r>
-            <w:t xml:space="preserve">.1 </w:t>
-          </w:r>
-          <w:r>
-            <w:t xml:space="preserve">Candidate </w:t>
-          </w:r>
-          <w:r>
-            <w:t xml:space="preserve">Election </w:t>
-          </w:r>
-          <w:r>
-            <w:t>Documents</w:t>
-          </w:r>
-          <w:r>
-            <w:t xml:space="preserve"> </w:t>
-          </w:r>
-          <w:r>
-            <w:ptab w:relativeTo="margin" w:alignment="right" w:leader="dot"/>
-          </w:r>
-          <w:r>
-            <w:t xml:space="preserve"> 5</w:t>
-          </w:r>
-        </w:p>
-        <w:p>
-          <w:pPr>
-            <w:pStyle w:val="TOC2"/>
-          </w:pPr>
-          <w:r>
-            <w:t>4</w:t>
-          </w:r>
-          <w:r>
-            <w:t>.</w:t>
-          </w:r>
-          <w:r>
-            <w:t>2</w:t>
-          </w:r>
-          <w:r>
-            <w:t xml:space="preserve"> </w:t>
-          </w:r>
-          <w:r>
-            <w:t>Voter Survey Data</w:t>
-          </w:r>
-          <w:r>
-            <w:t xml:space="preserve"> </w:t>
-          </w:r>
-          <w:r>
-            <w:ptab w:relativeTo="margin" w:alignment="right" w:leader="dot"/>
-          </w:r>
-          <w:r>
-            <w:t xml:space="preserve"> 5</w:t>
-          </w:r>
-        </w:p>
-        <w:p>
-          <w:pPr>
-            <w:pStyle w:val="TOC2"/>
-            <w:spacing w:line="480" w:lineRule="auto"/>
-          </w:pPr>
-          <w:r>
-            <w:t>4</w:t>
-          </w:r>
-          <w:r>
-            <w:t>.</w:t>
-          </w:r>
-          <w:r>
-            <w:t>3</w:t>
-          </w:r>
-          <w:r>
-            <w:t xml:space="preserve"> Other Data</w:t>
-          </w:r>
-          <w:r>
-            <w:t xml:space="preserve"> </w:t>
-          </w:r>
-          <w:r>
-            <w:ptab w:relativeTo="margin" w:alignment="right" w:leader="dot"/>
-          </w:r>
-          <w:r>
-            <w:t xml:space="preserve"> 5</w:t>
+            <w:t xml:space="preserve">Study One - </w:t>
           </w:r>
         </w:p>
         <w:p>
@@ -1409,7 +1225,6 @@
               <w:sz w:val="28"/>
               <w:szCs w:val="28"/>
             </w:rPr>
-            <w:lastRenderedPageBreak/>
             <w:t>Results</w:t>
           </w:r>
         </w:p>
@@ -1516,6 +1331,7 @@
             <w:pStyle w:val="TOC2"/>
           </w:pPr>
           <w:r>
+            <w:lastRenderedPageBreak/>
             <w:t>7</w:t>
           </w:r>
           <w:r>
@@ -1832,81 +1648,195 @@
           <w:sz w:val="28"/>
           <w:szCs w:val="28"/>
         </w:rPr>
+        <w:t xml:space="preserve">List of Abbreviations </w:t>
+      </w:r>
+    </w:p>
+    <w:p>
+      <w:r>
+        <w:t xml:space="preserve">ANES </w:t>
+      </w:r>
+      <w:r>
+        <w:t>- American National Election Studies</w:t>
+      </w:r>
+    </w:p>
+    <w:p>
+      <w:r>
+        <w:t>APP</w:t>
+      </w:r>
+    </w:p>
+    <w:p>
+      <w:r>
+        <w:t>UCSB</w:t>
+      </w:r>
+    </w:p>
+    <w:p>
+      <w:r>
+        <w:t>FIPS</w:t>
+      </w:r>
+    </w:p>
+    <w:p>
+      <w:r>
+        <w:t>C</w:t>
+      </w:r>
+      <w:r>
+        <w:t>-</w:t>
+      </w:r>
+      <w:r>
+        <w:t>Voter</w:t>
+      </w:r>
+    </w:p>
+    <w:p>
+      <w:r>
+        <w:t>M</w:t>
+      </w:r>
+      <w:r>
+        <w:t>-</w:t>
+      </w:r>
+      <w:r>
+        <w:t>Voter</w:t>
+      </w:r>
+    </w:p>
+    <w:p>
+      <w:pPr>
+        <w:rPr>
+          <w:b/>
+          <w:bCs/>
+          <w:sz w:val="28"/>
+          <w:szCs w:val="28"/>
+        </w:rPr>
+      </w:pPr>
+    </w:p>
+    <w:p>
+      <w:pPr>
+        <w:jc w:val="center"/>
+        <w:rPr>
+          <w:b/>
+          <w:bCs/>
+          <w:sz w:val="28"/>
+          <w:szCs w:val="28"/>
+        </w:rPr>
+      </w:pPr>
+    </w:p>
+    <w:p>
+      <w:pPr>
+        <w:jc w:val="center"/>
+        <w:rPr>
+          <w:b/>
+          <w:bCs/>
+          <w:sz w:val="28"/>
+          <w:szCs w:val="28"/>
+        </w:rPr>
+      </w:pPr>
+      <w:r>
+        <w:rPr>
+          <w:b/>
+          <w:bCs/>
+          <w:sz w:val="28"/>
+          <w:szCs w:val="28"/>
+        </w:rPr>
+        <w:t>Introduction</w:t>
+      </w:r>
+    </w:p>
+    <w:p>
+      <w:pPr>
+        <w:jc w:val="center"/>
+        <w:rPr>
+          <w:b/>
+          <w:bCs/>
+          <w:sz w:val="28"/>
+          <w:szCs w:val="28"/>
+        </w:rPr>
+      </w:pPr>
+    </w:p>
+    <w:p>
+      <w:r>
+        <w:t xml:space="preserve">Modern elections are often huge important entertainment spectacles, with multi-billion dollar industries on the fringe and collective attention. </w:t>
+      </w:r>
+    </w:p>
+    <w:p>
+      <w:r>
+        <w:t xml:space="preserve">But at their root, elections are one of the most fundamental and crucial aspects of the democratic system. </w:t>
+      </w:r>
+    </w:p>
+    <w:p>
+      <w:r>
+        <w:t>For 90% of the population, elections are primary avenue of exercise of democratic agency (compared to something like protesting, holding office, being a public servant...).</w:t>
+      </w:r>
+    </w:p>
+    <w:p>
+      <w:r>
+        <w:t>Elections determine the policy setting at home and the role of a country on the world stage (which is becoming increasingly important).</w:t>
+      </w:r>
+    </w:p>
+    <w:p>
+      <w:r>
+        <w:t xml:space="preserve">In a system like the United States, where the president holds so much executive power (contrasted with a parliamentary system like Canada, where the prime minister is more restrained), the importance of elections and the behaviour of the electorate cannot be overstated. </w:t>
+      </w:r>
+    </w:p>
+    <w:p/>
+    <w:p>
+      <w:r>
+        <w:t>In an ideal democratic system, voters would have perfect information and arguably, ideally make their decision purely on the basis of policy proposals. In reality: not only do voters not have perfect information, many of them (and importantly, large swathes of key swing voters) often don't even have much information, meaning that voter decisions are based on a mix information streams that create their PERCEPTION of a candidates.</w:t>
+      </w:r>
+    </w:p>
+    <w:p/>
+    <w:p>
+      <w:r>
+        <w:t>In our reality, electoral appeal is a dynamic phenomenon, influenced by several extrinsic factors, such as the state of the media, the global backdrop, and changing social attitudes, but also intrinsic attributes such as a candidate's age, perceived likeability, and social group.</w:t>
+      </w:r>
+    </w:p>
+    <w:p/>
+    <w:p>
+      <w:r>
+        <w:t>In a complex and large country such as the United States, this becomes further complicated by the diversity and dynamism of attitudes, backgrounds, and beliefs of the voters.</w:t>
+      </w:r>
+    </w:p>
+    <w:p>
+      <w:r>
+        <w:t>Since 2000, the United States has increasingly become a less-homogenous society. The globalization of trade and culture have spurred important economic and social divides.</w:t>
+      </w:r>
+    </w:p>
+    <w:p>
+      <w:r>
+        <w:t xml:space="preserve">Economic divides: </w:t>
+      </w:r>
+    </w:p>
+    <w:p>
+      <w:r>
+        <w:t xml:space="preserve">Decline in manufacturing and offshoring, which disproportionately affects certain regions of the country (such as midwest and south) and working-class people while benefiting the owners of the companies making these savings. </w:t>
+      </w:r>
+    </w:p>
+    <w:p>
+      <w:r>
+        <w:t>At the same time, the the adaptation to 'future industries' has been concentrated in the coastal cities of the country: whatever % of growth since 2000 has been in sectors like tech and services, which are based in [statistic about number of companies in silicon valley and GDP they bring to the nation).</w:t>
+      </w:r>
+    </w:p>
+    <w:p/>
+    <w:p>
+      <w:r>
+        <w:t>Understanding the structural, cultural, and economic trends that guide voters to their decisions becomes then not only an exercise of curiosity and interest, but a key and crucial study in shaping the messaging, posturing, and proposals of a party and candidate in order to most effectively reach the people that go to the ballot box.</w:t>
+      </w:r>
+    </w:p>
+    <w:p>
+      <w:r>
+        <w:t>In a world increasingly turning towards authoritarian and fascist tendencies, where it seems like history perhaps has not ended, understanding the perceptions and motivations of the electorate become an indispensable foundation for the fight against authoritarians and fascists, who would use the shield and sword of democracy to subjugate and control.</w:t>
+      </w:r>
+    </w:p>
+    <w:p>
+      <w:pPr>
+        <w:rPr>
+          <w:i/>
+          <w:iCs/>
+        </w:rPr>
+      </w:pPr>
+      <w:r>
+        <w:rPr>
+          <w:i/>
+          <w:iCs/>
+        </w:rPr>
         <w:lastRenderedPageBreak/>
-        <w:t>List of Abbreviations</w:t>
-      </w:r>
-      <w:r>
-        <w:rPr>
-          <w:b/>
-          <w:bCs/>
-          <w:sz w:val="28"/>
-          <w:szCs w:val="28"/>
-        </w:rPr>
-        <w:t xml:space="preserve"> </w:t>
-      </w:r>
-    </w:p>
-    <w:p>
-      <w:r>
-        <w:t xml:space="preserve">ANES </w:t>
-      </w:r>
-    </w:p>
-    <w:p>
-      <w:r>
-        <w:t>APP</w:t>
-      </w:r>
-    </w:p>
-    <w:p>
-      <w:r>
-        <w:t>UCSB</w:t>
-      </w:r>
-    </w:p>
-    <w:p>
-      <w:r>
-        <w:t>FIPS</w:t>
-      </w:r>
-    </w:p>
-    <w:p>
-      <w:r>
-        <w:t>C</w:t>
-      </w:r>
-      <w:r>
-        <w:t>-</w:t>
-      </w:r>
-      <w:r>
-        <w:t>Voter</w:t>
-      </w:r>
-    </w:p>
-    <w:p>
-      <w:r>
-        <w:t>M</w:t>
-      </w:r>
-      <w:r>
-        <w:t>-</w:t>
-      </w:r>
-      <w:r>
-        <w:t>Voter</w:t>
-      </w:r>
-    </w:p>
-    <w:p>
-      <w:pPr>
-        <w:rPr>
-          <w:b/>
-          <w:bCs/>
-          <w:sz w:val="28"/>
-          <w:szCs w:val="28"/>
-        </w:rPr>
-      </w:pPr>
-    </w:p>
-    <w:p>
-      <w:pPr>
-        <w:jc w:val="center"/>
-        <w:rPr>
-          <w:b/>
-          <w:bCs/>
-          <w:sz w:val="28"/>
-          <w:szCs w:val="28"/>
-        </w:rPr>
-      </w:pPr>
+        <w:t>“Das wird immer einer der besten Witze der Demokratie bleiben, daß sie ihren Todfeinden die Mittel selber stellte, durch die sie vernichtet wurde.“ Quote from: Joseph Goebbels, “Die Dummheit der Demokratie.” In: Joseph Goebbels, Der Angriff: Aufsätze aus der Kampfzeit (Munich: Franz Eher Nachfolger, 1935), p. 61.</w:t>
+      </w:r>
     </w:p>
     <w:p>
       <w:pPr>
@@ -1981,56 +1911,179 @@
       </w:r>
     </w:p>
     <w:p>
-      <w:pPr>
-        <w:rPr>
-          <w:b/>
-          <w:bCs/>
-        </w:rPr>
-      </w:pPr>
-    </w:p>
-    <w:p>
-      <w:pPr>
-        <w:rPr>
-          <w:b/>
-          <w:bCs/>
-        </w:rPr>
-      </w:pPr>
-      <w:r>
-        <w:rPr>
-          <w:b/>
-          <w:bCs/>
-        </w:rPr>
-        <w:t>Incumbency Advantage/ Anti-Incumbency Trends</w:t>
-      </w:r>
-      <w:r>
-        <w:rPr>
-          <w:b/>
-          <w:bCs/>
-        </w:rPr>
-        <w:t xml:space="preserve">/ </w:t>
-      </w:r>
-      <w:r>
-        <w:rPr>
-          <w:b/>
-          <w:bCs/>
-        </w:rPr>
-        <w:t>Dissatisfaction</w:t>
-      </w:r>
-    </w:p>
-    <w:p>
-      <w:pPr>
-        <w:rPr>
-          <w:b/>
-          <w:bCs/>
-        </w:rPr>
-      </w:pPr>
-    </w:p>
-    <w:p>
-      <w:r>
-        <w:rPr>
-          <w:b/>
-          <w:bCs/>
-        </w:rPr>
+      <w:r>
+        <w:t>Gender is the single best predictor for democrat republican vote since 2016</w:t>
+      </w:r>
+    </w:p>
+    <w:p>
+      <w:r>
+        <w:t>Age is important, young people tend to swing less between parties</w:t>
+      </w:r>
+    </w:p>
+    <w:p>
+      <w:r>
+        <w:t xml:space="preserve">Urban Rural divide explained partially by post NAFTA disenfranchisement of the rural/ industrial heartland of </w:t>
+      </w:r>
+      <w:r>
+        <w:t>A</w:t>
+      </w:r>
+      <w:r>
+        <w:t xml:space="preserve">merica. </w:t>
+      </w:r>
+    </w:p>
+    <w:p>
+      <w:r>
+        <w:t>Partisanship...</w:t>
+      </w:r>
+    </w:p>
+    <w:p>
+      <w:pPr>
+        <w:rPr>
+          <w:b/>
+          <w:bCs/>
+        </w:rPr>
+      </w:pPr>
+    </w:p>
+    <w:p>
+      <w:pPr>
+        <w:rPr>
+          <w:b/>
+          <w:bCs/>
+        </w:rPr>
+      </w:pPr>
+      <w:r>
+        <w:rPr>
+          <w:b/>
+          <w:bCs/>
+        </w:rPr>
+        <w:t xml:space="preserve">Candidate </w:t>
+      </w:r>
+      <w:r>
+        <w:rPr>
+          <w:b/>
+          <w:bCs/>
+        </w:rPr>
+        <w:t xml:space="preserve">'Change' </w:t>
+      </w:r>
+      <w:r>
+        <w:rPr>
+          <w:b/>
+          <w:bCs/>
+        </w:rPr>
+        <w:t>Posturing</w:t>
+      </w:r>
+      <w:r>
+        <w:rPr>
+          <w:b/>
+          <w:bCs/>
+        </w:rPr>
+        <w:t xml:space="preserve"> and Voter Perceptions</w:t>
+      </w:r>
+    </w:p>
+    <w:p>
+      <w:pPr>
+        <w:rPr>
+          <w:b/>
+          <w:bCs/>
+        </w:rPr>
+      </w:pPr>
+      <w:r>
+        <w:t>Increasingly global backdrop means that candidate stances are not only judged on the basis of domestic policy and in opposition to the other party, but also to world leaders and world events. Example of bush in 2004, who is recognized in the literature as having been the candidate of 'change' despite his having been the incumbent.</w:t>
+      </w:r>
+    </w:p>
+    <w:p>
+      <w:r>
+        <w:t>Similarly, Obama's appeak in 2008 as a change candidate was clear, given his message of 'change', 'hope', and his being black. However, he was once arguable once again the change candidate in the 2012 election due to the (global situation? fact that romney was so conservative and mormon? fallout of 2008 financial?)</w:t>
+      </w:r>
+    </w:p>
+    <w:p/>
+    <w:p/>
+    <w:p>
+      <w:pPr>
+        <w:rPr>
+          <w:b/>
+          <w:bCs/>
+        </w:rPr>
+      </w:pPr>
+      <w:r>
+        <w:t xml:space="preserve">PREV: </w:t>
+      </w:r>
+      <w:r>
+        <w:rPr>
+          <w:b/>
+          <w:bCs/>
+        </w:rPr>
+        <w:t>Candidate Posturing/ Perceptions</w:t>
+      </w:r>
+    </w:p>
+    <w:p>
+      <w:r>
+        <w:t>Need</w:t>
+      </w:r>
+      <w:r>
+        <w:t xml:space="preserve"> to mention that apparently mccain and obama both had 'change' in their slogans for 2008 (as did clinton and huckabee, but obama ana mccain persisted thru their nominations)</w:t>
+      </w:r>
+    </w:p>
+    <w:p/>
+    <w:p>
+      <w:pPr>
+        <w:rPr>
+          <w:b/>
+          <w:bCs/>
+          <w:sz w:val="28"/>
+          <w:szCs w:val="28"/>
+        </w:rPr>
+      </w:pPr>
+      <w:r>
+        <w:t>Levine et al. (2001) has a great section on messaging in political campaigns and WHAT people consider important for voting on (in terms of character etc).</w:t>
+      </w:r>
+    </w:p>
+    <w:p/>
+    <w:p/>
+    <w:p>
+      <w:r>
+        <w:t>Need to mention also how an incumbent can sell 'change' or even be the 'change candidate'. Maybe say like "posturing themselves as best suited to deliver change in the face of GLOBAL situation or MICRO FINANCIAL situations, not 'change' in the way the country looks or which party is in power).</w:t>
+      </w:r>
+    </w:p>
+    <w:p/>
+    <w:p>
+      <w:pPr>
+        <w:rPr>
+          <w:i/>
+          <w:iCs/>
+        </w:rPr>
+      </w:pPr>
+      <w:r>
+        <w:rPr>
+          <w:i/>
+          <w:iCs/>
+        </w:rPr>
+        <w:t>" Of course, the party that is not in the White House maybe able to make a stronger case for change, but even the incumbent party—and theincumbent himself in 2004—used the strategy. Specifically, president George W. Bushran on a platform he said was well suited for “changing times” in a “changed world”(Brownstein, 2004)." Levine et al. (2001)</w:t>
+      </w:r>
+    </w:p>
+    <w:p>
+      <w:pPr>
+        <w:rPr>
+          <w:b/>
+          <w:bCs/>
+        </w:rPr>
+      </w:pPr>
+    </w:p>
+    <w:p>
+      <w:pPr>
+        <w:rPr>
+          <w:b/>
+          <w:bCs/>
+        </w:rPr>
+      </w:pPr>
+    </w:p>
+    <w:p>
+      <w:r>
+        <w:rPr>
+          <w:b/>
+          <w:bCs/>
+        </w:rPr>
+        <w:lastRenderedPageBreak/>
         <w:t>Voting for 'Change'</w:t>
       </w:r>
     </w:p>
@@ -2055,16 +2108,7 @@
     </w:p>
     <w:p>
       <w:r>
-        <w:t xml:space="preserve">Inspects the way that </w:t>
-      </w:r>
-      <w:r>
-        <w:t xml:space="preserve">young </w:t>
-      </w:r>
-      <w:r>
-        <w:t>voters interpreted the messages of 'change'</w:t>
-      </w:r>
-      <w:r>
-        <w:t>, "</w:t>
+        <w:t>Inspects the way that young voters interpreted the messages of 'change', "</w:t>
       </w:r>
       <w:r>
         <w:t>both in an overall sense</w:t>
@@ -2076,46 +2120,7 @@
         <w:t>and as attributed to each of the candidates</w:t>
       </w:r>
       <w:r>
-        <w:t>" (Levine et. al</w:t>
-      </w:r>
-      <w:r>
-        <w:t xml:space="preserve">, </w:t>
-      </w:r>
-      <w:r>
-        <w:t>2001).</w:t>
-      </w:r>
-      <w:r>
-        <w:t xml:space="preserve"> The authors conduct two surveys, one before the 2008 primary election and one shortly before the general election, taking ~800 and ~200 undergraduate students as respondents, respectively</w:t>
-      </w:r>
-      <w:r>
-        <w:t xml:space="preserve">. The authors find </w:t>
-      </w:r>
-      <w:r>
-        <w:t xml:space="preserve">different </w:t>
-      </w:r>
-      <w:r>
-        <w:t>types of 'change'</w:t>
-      </w:r>
-      <w:r>
-        <w:t xml:space="preserve"> interpretations by </w:t>
-      </w:r>
-      <w:r>
-        <w:t>respondent</w:t>
-      </w:r>
-      <w:r>
-        <w:t xml:space="preserve">s, as well as </w:t>
-      </w:r>
-      <w:r>
-        <w:t xml:space="preserve">differing </w:t>
-      </w:r>
-      <w:r>
-        <w:t xml:space="preserve">levels of </w:t>
-      </w:r>
-      <w:r>
-        <w:t>relevan</w:t>
-      </w:r>
-      <w:r>
-        <w:t>ce for different demographics.</w:t>
+        <w:t>" (Levine et. al, 2001). The authors conduct two surveys, one before the 2008 primary election and one shortly before the general election, taking ~800 and ~200 undergraduate students as respondents, respectively. The authors find different types of 'change' interpretations by respondents, as well as differing levels of relevance for different demographics.</w:t>
       </w:r>
     </w:p>
     <w:p>
@@ -2131,74 +2136,69 @@
           <w:i/>
           <w:iCs/>
         </w:rPr>
-        <w:t xml:space="preserve">Overall, our survey respondents applied change, as an overriding </w:t>
-      </w:r>
-      <w:proofErr w:type="spellStart"/>
-      <w:proofErr w:type="gramStart"/>
+        <w:t>Overall, our survey respondents applied change, as an overriding concept,to six specific areas: race of the candidate, gender of the candidate, cultural policy,economic policy, foreign policy, health care, and other responses that fell into a seventh category called “overall change</w:t>
+      </w:r>
       <w:r>
         <w:rPr>
           <w:i/>
           <w:iCs/>
         </w:rPr>
-        <w:t>concept,to</w:t>
-      </w:r>
-      <w:proofErr w:type="spellEnd"/>
-      <w:proofErr w:type="gramEnd"/>
-      <w:r>
+        <w:t xml:space="preserve">." </w:t>
+      </w:r>
+      <w:r>
+        <w:t xml:space="preserve">Levine et. al (2001) </w:t>
+      </w:r>
+    </w:p>
+    <w:p>
+      <w:pPr>
         <w:rPr>
           <w:i/>
           <w:iCs/>
         </w:rPr>
-        <w:t xml:space="preserve"> six specific areas: race of the candidate, gender of the candidate, cultural </w:t>
-      </w:r>
-      <w:proofErr w:type="spellStart"/>
-      <w:r>
+      </w:pPr>
+    </w:p>
+    <w:p>
+      <w:pPr>
         <w:rPr>
           <w:i/>
           <w:iCs/>
         </w:rPr>
-        <w:t>policy,economic</w:t>
-      </w:r>
-      <w:proofErr w:type="spellEnd"/>
+      </w:pPr>
       <w:r>
         <w:rPr>
           <w:i/>
           <w:iCs/>
         </w:rPr>
-        <w:t xml:space="preserve"> policy, foreign policy, health care, and other responses that fell into a seventh category called “overall change</w:t>
-      </w:r>
-      <w:r>
+        <w:t>SURVEY EXPERIMENT 1:</w:t>
+      </w:r>
+    </w:p>
+    <w:p>
+      <w:pPr>
         <w:rPr>
           <w:i/>
           <w:iCs/>
         </w:rPr>
-        <w:t xml:space="preserve">." </w:t>
-      </w:r>
-      <w:r>
-        <w:t xml:space="preserve">Levine et. al (2001) </w:t>
-      </w:r>
-    </w:p>
-    <w:p>
-      <w:pPr>
+      </w:pPr>
+      <w:r>
         <w:rPr>
           <w:i/>
           <w:iCs/>
         </w:rPr>
-      </w:pPr>
-    </w:p>
-    <w:p>
-      <w:pPr>
+        <w:t>"</w:t>
+      </w:r>
+      <w:r>
         <w:rPr>
           <w:i/>
           <w:iCs/>
         </w:rPr>
-      </w:pPr>
+        <w:t>Research Question 3: How Do Demographics Influence the Way These VotersDefine Change? The survey also measured the definition of each candidate’s versionof change. Overall, a chi-square analysis found significant differences among the dif-ferent supporters on a general sense of change and change in health care, gender issues,and race.</w:t>
+      </w:r>
       <w:r>
         <w:rPr>
           <w:i/>
           <w:iCs/>
         </w:rPr>
-        <w:t>SURVEY EXPERIMENT 1:</w:t>
+        <w:t xml:space="preserve"> </w:t>
       </w:r>
     </w:p>
     <w:p>
@@ -2213,87 +2213,89 @@
           <w:i/>
           <w:iCs/>
         </w:rPr>
-        <w:t>"</w:t>
-      </w:r>
-      <w:r>
+        <w:t>Of the respondents who identified issues categorized as “overall change,” a differ-ence was found between White and African American respondents, χ 2 (2) = 20.627,p = .00, whereby 87% of the responses were from White participants, and 10.7% werefrom African American participants. However, those respondents who identifiedObama as their choice were also more likely to discuss issues of overall change thansupporters of the other candidates, χ 2(2) = 21.185, p &lt; .05.</w:t>
+      </w:r>
+    </w:p>
+    <w:p>
+      <w:pPr>
         <w:rPr>
           <w:i/>
           <w:iCs/>
         </w:rPr>
-        <w:t xml:space="preserve">Research Question 3: How Do Demographics Influence the Way These </w:t>
-      </w:r>
-      <w:proofErr w:type="spellStart"/>
+      </w:pPr>
       <w:r>
         <w:rPr>
           <w:i/>
           <w:iCs/>
         </w:rPr>
-        <w:t>VotersDefine</w:t>
-      </w:r>
-      <w:proofErr w:type="spellEnd"/>
+        <w:t>The topic of health care was discussed more often by women than men, χ2(2) =8.048, p &lt; .05. Similar to the category of overall change, the participants who identi-fied Obama as their choice discussed the importance of change and health care, χ2(2) =18.571, p &lt; .05, more than supporters of the other candidates.</w:t>
+      </w:r>
+    </w:p>
+    <w:p>
       <w:r>
         <w:rPr>
           <w:i/>
           <w:iCs/>
         </w:rPr>
-        <w:t xml:space="preserve"> Change? The survey also measured the definition of each candidate’s </w:t>
-      </w:r>
-      <w:proofErr w:type="spellStart"/>
+        <w:t>Although there were no significant findings for the race of the candidate, a surpris-ing finding was that Obama supporters discussed the biological sex of the candidates</w:t>
+      </w:r>
       <w:r>
         <w:rPr>
           <w:i/>
           <w:iCs/>
         </w:rPr>
-        <w:t>versionof</w:t>
-      </w:r>
-      <w:proofErr w:type="spellEnd"/>
+        <w:t xml:space="preserve"> </w:t>
+      </w:r>
       <w:r>
         <w:rPr>
           <w:i/>
           <w:iCs/>
         </w:rPr>
-        <w:t xml:space="preserve"> change. Overall, a chi-square analysis found significant differences among the </w:t>
-      </w:r>
-      <w:proofErr w:type="spellStart"/>
+        <w:t>more than supporters of the other candidates, χ2(2) = 13.478, p &lt; .05.</w:t>
+      </w:r>
       <w:r>
         <w:rPr>
           <w:i/>
           <w:iCs/>
         </w:rPr>
-        <w:t>dif-ferent</w:t>
-      </w:r>
-      <w:proofErr w:type="spellEnd"/>
-      <w:r>
+        <w:t>"</w:t>
+      </w:r>
+      <w:r>
+        <w:t xml:space="preserve"> </w:t>
+      </w:r>
+      <w:r>
+        <w:t xml:space="preserve">Levine et. al (2001) </w:t>
+      </w:r>
+    </w:p>
+    <w:p/>
+    <w:p>
+      <w:pPr>
         <w:rPr>
           <w:i/>
           <w:iCs/>
         </w:rPr>
-        <w:t xml:space="preserve"> supporters on a general sense of change and change in health care, gender </w:t>
-      </w:r>
-      <w:proofErr w:type="spellStart"/>
-      <w:proofErr w:type="gramStart"/>
+      </w:pPr>
       <w:r>
         <w:rPr>
           <w:i/>
           <w:iCs/>
         </w:rPr>
-        <w:t>issues,and</w:t>
-      </w:r>
-      <w:proofErr w:type="spellEnd"/>
-      <w:proofErr w:type="gramEnd"/>
-      <w:r>
+        <w:t>SURVEY EXPERIMENT 2:</w:t>
+      </w:r>
+    </w:p>
+    <w:p>
+      <w:pPr>
         <w:rPr>
           <w:i/>
           <w:iCs/>
         </w:rPr>
-        <w:t xml:space="preserve"> race.</w:t>
-      </w:r>
+      </w:pPr>
       <w:r>
         <w:rPr>
           <w:i/>
           <w:iCs/>
         </w:rPr>
-        <w:t xml:space="preserve"> </w:t>
+        <w:t>..... they do xyz</w:t>
       </w:r>
     </w:p>
     <w:p>
@@ -2303,648 +2305,411 @@
           <w:iCs/>
         </w:rPr>
       </w:pPr>
+    </w:p>
+    <w:p/>
+    <w:p>
+      <w:r>
+        <w:t>(Wüst 2022)</w:t>
+      </w:r>
+    </w:p>
+    <w:p>
+      <w:r>
+        <w:t xml:space="preserve">German one says youth voted for change via new pol parties (or just not the classic coalition SPD CDU), </w:t>
+      </w:r>
+    </w:p>
+    <w:p>
+      <w:r>
+        <w:t xml:space="preserve">"article provides empirical evidence for </w:t>
+      </w:r>
+      <w:r>
+        <w:t>dissatisfaction with the grand coalition government and the quest for change among young voters</w:t>
+      </w:r>
+      <w:r>
+        <w:t>"</w:t>
+      </w:r>
+    </w:p>
+    <w:p>
+      <w:r>
+        <w:t>reasons for voting:</w:t>
+      </w:r>
+      <w:r>
+        <w:t>" a fight against climate change combined with state-centered social policies among Green voters, and a broad liberal program for progress among fdp voters</w:t>
+      </w:r>
+      <w:r>
+        <w:t>"</w:t>
+      </w:r>
+    </w:p>
+    <w:p>
+      <w:r>
+        <w:lastRenderedPageBreak/>
+        <w:t>"</w:t>
+      </w:r>
+      <w:r>
+        <w:t>Yet the reasons that young people support these parties differ significantly. Thus, it is thin empirical ice to associate the yellow-green boost among young voters with a new generational cleavage.</w:t>
+      </w:r>
+      <w:r>
+        <w:t>"</w:t>
+      </w:r>
+    </w:p>
+    <w:p>
+      <w:r>
+        <w:t xml:space="preserve">We should also note that there is a different dynamic in a parliamentary system due to 1) you are typically voting for a party more than for a specific candidate (whereas in the US, presidential elections have a large personal character element) and 2) voting for a 'change' party that is in the political fringe/ not established or strong can have several other motivators, such as pressuring the dominant parties to take notice of dissatisfaction/ to effect change. </w:t>
+      </w:r>
+    </w:p>
+    <w:p>
+      <w:r>
+        <w:t>Greens has a very identifiable, inherently highly 'change' stance: action towards sustainability and climate change [need here a quote from the greens of what they stand for] which is not really possible in the de-facto two-party system of the United States.</w:t>
+      </w:r>
+    </w:p>
+    <w:p>
+      <w:pPr>
+        <w:rPr>
+          <w:b/>
+          <w:bCs/>
+        </w:rPr>
+      </w:pPr>
+    </w:p>
+    <w:p>
+      <w:pPr>
+        <w:rPr>
+          <w:b/>
+          <w:bCs/>
+        </w:rPr>
+      </w:pPr>
+    </w:p>
+    <w:p/>
+    <w:p>
+      <w:pPr>
+        <w:rPr>
+          <w:b/>
+          <w:bCs/>
+          <w:sz w:val="28"/>
+          <w:szCs w:val="28"/>
+        </w:rPr>
+      </w:pPr>
+    </w:p>
+    <w:p>
+      <w:pPr>
+        <w:jc w:val="center"/>
+        <w:rPr>
+          <w:b/>
+          <w:bCs/>
+          <w:sz w:val="28"/>
+          <w:szCs w:val="28"/>
+        </w:rPr>
+      </w:pPr>
+    </w:p>
+    <w:p>
+      <w:pPr>
+        <w:jc w:val="center"/>
+        <w:rPr>
+          <w:b/>
+          <w:bCs/>
+          <w:sz w:val="28"/>
+          <w:szCs w:val="28"/>
+        </w:rPr>
+      </w:pPr>
+    </w:p>
+    <w:p>
+      <w:pPr>
+        <w:jc w:val="center"/>
+        <w:rPr>
+          <w:b/>
+          <w:bCs/>
+          <w:sz w:val="28"/>
+          <w:szCs w:val="28"/>
+        </w:rPr>
+      </w:pPr>
+    </w:p>
+    <w:p>
+      <w:pPr>
+        <w:jc w:val="center"/>
+        <w:rPr>
+          <w:b/>
+          <w:bCs/>
+          <w:sz w:val="28"/>
+          <w:szCs w:val="28"/>
+        </w:rPr>
+      </w:pPr>
+    </w:p>
+    <w:p>
+      <w:pPr>
+        <w:jc w:val="center"/>
+        <w:rPr>
+          <w:b/>
+          <w:bCs/>
+          <w:sz w:val="28"/>
+          <w:szCs w:val="28"/>
+        </w:rPr>
+      </w:pPr>
+    </w:p>
+    <w:p>
+      <w:pPr>
+        <w:jc w:val="center"/>
+        <w:rPr>
+          <w:b/>
+          <w:bCs/>
+          <w:sz w:val="28"/>
+          <w:szCs w:val="28"/>
+        </w:rPr>
+      </w:pPr>
+    </w:p>
+    <w:p>
+      <w:pPr>
+        <w:jc w:val="center"/>
+        <w:rPr>
+          <w:b/>
+          <w:bCs/>
+          <w:sz w:val="28"/>
+          <w:szCs w:val="28"/>
+        </w:rPr>
+      </w:pPr>
+    </w:p>
+    <w:p>
+      <w:pPr>
+        <w:jc w:val="center"/>
+        <w:rPr>
+          <w:b/>
+          <w:bCs/>
+          <w:sz w:val="28"/>
+          <w:szCs w:val="28"/>
+        </w:rPr>
+      </w:pPr>
+    </w:p>
+    <w:p>
+      <w:pPr>
+        <w:jc w:val="center"/>
+        <w:rPr>
+          <w:b/>
+          <w:bCs/>
+          <w:sz w:val="28"/>
+          <w:szCs w:val="28"/>
+        </w:rPr>
+      </w:pPr>
+    </w:p>
+    <w:p>
+      <w:pPr>
+        <w:jc w:val="center"/>
+        <w:rPr>
+          <w:b/>
+          <w:bCs/>
+          <w:sz w:val="28"/>
+          <w:szCs w:val="28"/>
+        </w:rPr>
+      </w:pPr>
+    </w:p>
+    <w:p>
+      <w:pPr>
+        <w:rPr>
+          <w:b/>
+          <w:bCs/>
+          <w:sz w:val="28"/>
+          <w:szCs w:val="28"/>
+        </w:rPr>
+      </w:pPr>
+      <w:r>
+        <w:rPr>
+          <w:b/>
+          <w:bCs/>
+          <w:sz w:val="28"/>
+          <w:szCs w:val="28"/>
+        </w:rPr>
+        <w:t>Pret</w:t>
+      </w:r>
+      <w:r>
+        <w:rPr>
+          <w:b/>
+          <w:bCs/>
+          <w:sz w:val="28"/>
+          <w:szCs w:val="28"/>
+        </w:rPr>
+        <w:t>entious Formula</w:t>
+      </w:r>
+      <w:r>
+        <w:rPr>
+          <w:b/>
+          <w:bCs/>
+          <w:sz w:val="28"/>
+          <w:szCs w:val="28"/>
+        </w:rPr>
+        <w:t>e</w:t>
+      </w:r>
+      <w:r>
+        <w:rPr>
+          <w:b/>
+          <w:bCs/>
+          <w:sz w:val="28"/>
+          <w:szCs w:val="28"/>
+        </w:rPr>
+        <w:t xml:space="preserve"> : )</w:t>
+      </w:r>
+    </w:p>
+    <w:p>
+      <w:pPr>
+        <w:rPr>
+          <w:rFonts w:eastAsiaTheme="minorEastAsia"/>
+        </w:rPr>
+      </w:pPr>
+      <w:r>
+        <w:t xml:space="preserve">In practice, the CI represents a weighted summation of each of the component variables. For variables </w:t>
+      </w:r>
       <w:r>
         <w:rPr>
           <w:i/>
           <w:iCs/>
         </w:rPr>
-        <w:t>Of the respondents who identified issues categorized as “overall change,” a differ-</w:t>
-      </w:r>
-      <w:proofErr w:type="spellStart"/>
+        <w:t>v1, v2, v3,...vk</w:t>
+      </w:r>
+      <w:r>
+        <w:t xml:space="preserve">, we have respective weights </w:t>
+      </w:r>
       <w:r>
         <w:rPr>
           <w:i/>
           <w:iCs/>
         </w:rPr>
-        <w:t>ence</w:t>
-      </w:r>
-      <w:proofErr w:type="spellEnd"/>
+        <w:t>w1, w2, w3,...wk</w:t>
+      </w:r>
+      <w:r>
+        <w:t xml:space="preserve">, </w:t>
+      </w:r>
+      <w:r>
+        <w:rPr>
+          <w:rFonts w:eastAsiaTheme="minorEastAsia"/>
+        </w:rPr>
+        <w:t>where the sum of weights (</w:t>
+      </w:r>
       <w:r>
         <w:rPr>
           <w:i/>
           <w:iCs/>
         </w:rPr>
-        <w:t xml:space="preserve"> was found between White and African American respondents, χ 2 (2) = </w:t>
-      </w:r>
-      <w:proofErr w:type="gramStart"/>
+        <w:t>w1+w2+w3+...wk</w:t>
+      </w:r>
+      <w:r>
+        <w:t>)</w:t>
+      </w:r>
+      <w:r>
+        <w:t xml:space="preserve"> = 1. This weighted sum is formally denoted as </w:t>
+      </w:r>
       <w:r>
         <w:rPr>
           <w:i/>
           <w:iCs/>
         </w:rPr>
-        <w:t>20.627,p</w:t>
-      </w:r>
-      <w:proofErr w:type="gramEnd"/>
-      <w:r>
-        <w:rPr>
-          <w:i/>
-          <w:iCs/>
-        </w:rPr>
-        <w:t xml:space="preserve"> = .00, whereby 87% of the responses were from White participants, and 10.7% </w:t>
-      </w:r>
-      <w:proofErr w:type="spellStart"/>
-      <w:r>
-        <w:rPr>
-          <w:i/>
-          <w:iCs/>
-        </w:rPr>
-        <w:t>werefrom</w:t>
-      </w:r>
-      <w:proofErr w:type="spellEnd"/>
-      <w:r>
-        <w:rPr>
-          <w:i/>
-          <w:iCs/>
-        </w:rPr>
-        <w:t xml:space="preserve"> African American participants. However, those respondents who </w:t>
-      </w:r>
-      <w:proofErr w:type="spellStart"/>
-      <w:r>
-        <w:rPr>
-          <w:i/>
-          <w:iCs/>
-        </w:rPr>
-        <w:t>identifiedObama</w:t>
-      </w:r>
-      <w:proofErr w:type="spellEnd"/>
-      <w:r>
-        <w:rPr>
-          <w:i/>
-          <w:iCs/>
-        </w:rPr>
-        <w:t xml:space="preserve"> as their choice were also more likely to discuss issues of overall change </w:t>
-      </w:r>
-      <w:proofErr w:type="spellStart"/>
-      <w:r>
-        <w:rPr>
-          <w:i/>
-          <w:iCs/>
-        </w:rPr>
-        <w:t>thansupporters</w:t>
-      </w:r>
-      <w:proofErr w:type="spellEnd"/>
-      <w:r>
-        <w:rPr>
-          <w:i/>
-          <w:iCs/>
-        </w:rPr>
-        <w:t xml:space="preserve"> of the other candidates, χ 2(2) = 21.185, p &lt; .05.</w:t>
-      </w:r>
-    </w:p>
-    <w:p>
-      <w:pPr>
-        <w:rPr>
-          <w:i/>
-          <w:iCs/>
-        </w:rPr>
-      </w:pPr>
-      <w:r>
-        <w:rPr>
-          <w:i/>
-          <w:iCs/>
-        </w:rPr>
-        <w:lastRenderedPageBreak/>
-        <w:t xml:space="preserve">The topic of health care was discussed more often by women than men, χ2(2) =8.048, p &lt; .05. Similar to the category of overall change, the participants who </w:t>
-      </w:r>
-      <w:proofErr w:type="spellStart"/>
-      <w:r>
-        <w:rPr>
-          <w:i/>
-          <w:iCs/>
-        </w:rPr>
-        <w:t>identi-fied</w:t>
-      </w:r>
-      <w:proofErr w:type="spellEnd"/>
-      <w:r>
-        <w:rPr>
-          <w:i/>
-          <w:iCs/>
-        </w:rPr>
-        <w:t xml:space="preserve"> Obama as their choice discussed the importance of change and health care, χ2(2) =18.571, p &lt; .05, more than supporters of the other candidates.</w:t>
-      </w:r>
-    </w:p>
-    <w:p>
-      <w:r>
-        <w:rPr>
-          <w:i/>
-          <w:iCs/>
-        </w:rPr>
-        <w:t xml:space="preserve">Although there were no significant findings for the race of the candidate, a </w:t>
-      </w:r>
-      <w:proofErr w:type="spellStart"/>
-      <w:r>
-        <w:rPr>
-          <w:i/>
-          <w:iCs/>
-        </w:rPr>
-        <w:t>surpris-ing</w:t>
-      </w:r>
-      <w:proofErr w:type="spellEnd"/>
-      <w:r>
-        <w:rPr>
-          <w:i/>
-          <w:iCs/>
-        </w:rPr>
-        <w:t xml:space="preserve"> finding was that Obama supporters discussed the biological sex of the candidates</w:t>
-      </w:r>
-      <w:r>
-        <w:rPr>
-          <w:i/>
-          <w:iCs/>
-        </w:rPr>
-        <w:t xml:space="preserve"> </w:t>
-      </w:r>
-      <w:r>
-        <w:rPr>
-          <w:i/>
-          <w:iCs/>
-        </w:rPr>
-        <w:t>more than supporters of the other candidates, χ2(2) = 13.478, p &lt; .05.</w:t>
-      </w:r>
-      <w:r>
-        <w:rPr>
-          <w:i/>
-          <w:iCs/>
-        </w:rPr>
-        <w:t>"</w:t>
-      </w:r>
-      <w:r>
-        <w:t xml:space="preserve"> </w:t>
-      </w:r>
-      <w:r>
-        <w:t xml:space="preserve">Levine et. al (2001) </w:t>
-      </w:r>
-    </w:p>
-    <w:p/>
-    <w:p>
-      <w:pPr>
-        <w:rPr>
-          <w:i/>
-          <w:iCs/>
-        </w:rPr>
-      </w:pPr>
-      <w:r>
-        <w:rPr>
-          <w:i/>
-          <w:iCs/>
-        </w:rPr>
-        <w:t>SURVEY EXPERIMENT 2:</w:t>
-      </w:r>
-    </w:p>
-    <w:p>
-      <w:pPr>
-        <w:rPr>
-          <w:i/>
-          <w:iCs/>
-        </w:rPr>
-      </w:pPr>
-    </w:p>
-    <w:p/>
-    <w:p>
-      <w:r>
-        <w:t>(</w:t>
-      </w:r>
-      <w:proofErr w:type="spellStart"/>
-      <w:r>
-        <w:t>Wüst</w:t>
-      </w:r>
-      <w:proofErr w:type="spellEnd"/>
-      <w:r>
-        <w:t xml:space="preserve"> 2022</w:t>
-      </w:r>
-      <w:r>
-        <w:t>)</w:t>
-      </w:r>
-    </w:p>
-    <w:p>
-      <w:proofErr w:type="gramStart"/>
-      <w:r>
-        <w:t>German</w:t>
-      </w:r>
-      <w:proofErr w:type="gramEnd"/>
-      <w:r>
-        <w:t xml:space="preserve"> one says youth voted for change via new pol parties (or just not the classic coalition SPD CDU), </w:t>
-      </w:r>
-    </w:p>
-    <w:p>
-      <w:r>
-        <w:t>"</w:t>
-      </w:r>
-      <w:proofErr w:type="gramStart"/>
-      <w:r>
-        <w:t>article</w:t>
-      </w:r>
-      <w:proofErr w:type="gramEnd"/>
-      <w:r>
-        <w:t xml:space="preserve"> provides empirical evidence for </w:t>
-      </w:r>
-      <w:r>
-        <w:t>dissatisfaction with the grand coalition government and the quest for change among young voters</w:t>
-      </w:r>
-      <w:r>
-        <w:t>"</w:t>
-      </w:r>
-    </w:p>
-    <w:p>
-      <w:r>
-        <w:t>reasons for voting</w:t>
-      </w:r>
-      <w:r>
-        <w:t>:</w:t>
-      </w:r>
-      <w:r>
-        <w:t xml:space="preserve">" a fight against climate change combined with state-centered social policies among Green voters, and a broad liberal program for progress among </w:t>
-      </w:r>
-      <w:proofErr w:type="spellStart"/>
-      <w:r>
-        <w:t>fdp</w:t>
-      </w:r>
-      <w:proofErr w:type="spellEnd"/>
-      <w:r>
-        <w:t xml:space="preserve"> voters</w:t>
-      </w:r>
-      <w:r>
-        <w:t>"</w:t>
-      </w:r>
-    </w:p>
-    <w:p>
-      <w:r>
-        <w:t>"</w:t>
-      </w:r>
-      <w:r>
-        <w:t>Yet the reasons that young people support these parties differ significantly. Thus, it is thin empirical ice to associate the yellow-green boost among young voters with a new generational cleavage.</w:t>
-      </w:r>
-      <w:r>
-        <w:t>"</w:t>
-      </w:r>
-    </w:p>
-    <w:p>
-      <w:r>
-        <w:t xml:space="preserve">We should also note that there is a different dynamic in a </w:t>
-      </w:r>
-      <w:r>
-        <w:t>parliamentary system</w:t>
-      </w:r>
-      <w:r>
-        <w:t xml:space="preserve"> due to</w:t>
-      </w:r>
-      <w:r>
-        <w:t xml:space="preserve"> 1) you are typically voting for a party more than for a specific candidate </w:t>
-      </w:r>
-      <w:r>
-        <w:t>(whereas in the US, presidential elections have a large personal character element) and</w:t>
-      </w:r>
-      <w:r>
-        <w:t xml:space="preserve"> 2) voting for a 'change' party that is in the political fringe/ not established or strong can have several other motivators, such as pressuring the dominant parties to take notice of dissatisfaction/ to effect change. </w:t>
-      </w:r>
-    </w:p>
-    <w:p>
-      <w:r>
-        <w:t>G</w:t>
-      </w:r>
-      <w:r>
-        <w:t>reens</w:t>
-      </w:r>
-      <w:r>
-        <w:t xml:space="preserve"> </w:t>
-      </w:r>
-      <w:r>
-        <w:t>has a very identifiable, inherently highly 'change' stance: action towards sustainability and climate change [need here a quote from the greens of what they stand for]</w:t>
-      </w:r>
-      <w:r>
-        <w:t xml:space="preserve"> which is not really possible in the de-facto two-party system of the United States.</w:t>
-      </w:r>
-    </w:p>
-    <w:p>
-      <w:pPr>
-        <w:rPr>
-          <w:b/>
-          <w:bCs/>
-        </w:rPr>
-      </w:pPr>
-    </w:p>
-    <w:p>
-      <w:pPr>
-        <w:rPr>
-          <w:b/>
-          <w:bCs/>
-        </w:rPr>
-      </w:pPr>
-    </w:p>
-    <w:p>
-      <w:pPr>
-        <w:rPr>
-          <w:b/>
-          <w:bCs/>
-        </w:rPr>
-      </w:pPr>
-      <w:r>
-        <w:rPr>
-          <w:b/>
-          <w:bCs/>
-        </w:rPr>
-        <w:t>Candidate Posturing/ Perceptions</w:t>
-      </w:r>
-    </w:p>
-    <w:p>
-      <w:r>
-        <w:t>Need</w:t>
-      </w:r>
-      <w:r>
-        <w:t xml:space="preserve"> to mention that apparently </w:t>
-      </w:r>
-      <w:proofErr w:type="spellStart"/>
-      <w:r>
-        <w:t>mccain</w:t>
-      </w:r>
-      <w:proofErr w:type="spellEnd"/>
-      <w:r>
-        <w:t xml:space="preserve"> and </w:t>
-      </w:r>
-      <w:proofErr w:type="spellStart"/>
-      <w:r>
-        <w:t>obama</w:t>
-      </w:r>
-      <w:proofErr w:type="spellEnd"/>
-      <w:r>
-        <w:t xml:space="preserve"> both had 'change' in their slogans for 2008 (as did </w:t>
-      </w:r>
-      <w:proofErr w:type="spellStart"/>
-      <w:r>
-        <w:t>clinton</w:t>
-      </w:r>
-      <w:proofErr w:type="spellEnd"/>
-      <w:r>
-        <w:t xml:space="preserve"> and </w:t>
-      </w:r>
-      <w:proofErr w:type="spellStart"/>
-      <w:r>
-        <w:t>huckabee</w:t>
-      </w:r>
-      <w:proofErr w:type="spellEnd"/>
-      <w:r>
-        <w:t xml:space="preserve">, but </w:t>
-      </w:r>
-      <w:proofErr w:type="spellStart"/>
-      <w:r>
-        <w:t>obama</w:t>
-      </w:r>
-      <w:proofErr w:type="spellEnd"/>
-      <w:r>
-        <w:t xml:space="preserve"> ana </w:t>
-      </w:r>
-      <w:proofErr w:type="spellStart"/>
-      <w:r>
-        <w:t>mccain</w:t>
-      </w:r>
-      <w:proofErr w:type="spellEnd"/>
-      <w:r>
-        <w:t xml:space="preserve"> persisted thru their nominations)</w:t>
-      </w:r>
-    </w:p>
-    <w:p/>
-    <w:p>
-      <w:pPr>
-        <w:rPr>
-          <w:b/>
-          <w:bCs/>
-          <w:sz w:val="28"/>
-          <w:szCs w:val="28"/>
-        </w:rPr>
-      </w:pPr>
-      <w:r>
-        <w:t xml:space="preserve">Levine et al. (2001) has a great section on messaging in political campaigns and WHAT people consider important for voting on (in terms of character </w:t>
-      </w:r>
-      <w:proofErr w:type="spellStart"/>
-      <w:r>
-        <w:t>etc</w:t>
-      </w:r>
-      <w:proofErr w:type="spellEnd"/>
-      <w:r>
-        <w:t>).</w:t>
-      </w:r>
-    </w:p>
-    <w:p/>
-    <w:p/>
-    <w:p>
-      <w:r>
-        <w:t>Need to mention also how an incumbent can sell 'change' or even be the 'change candidate'. Maybe say like</w:t>
-      </w:r>
-      <w:r>
-        <w:t xml:space="preserve"> "posturing themselves as best suited to deliver change in the face of GLOBAL situation or MICRO FINANCIAL situations, not 'change' in the way the country </w:t>
-      </w:r>
-      <w:proofErr w:type="gramStart"/>
-      <w:r>
-        <w:t>looks</w:t>
-      </w:r>
-      <w:proofErr w:type="gramEnd"/>
-      <w:r>
-        <w:t xml:space="preserve"> or which party is in power).</w:t>
-      </w:r>
-    </w:p>
-    <w:p/>
-    <w:p>
-      <w:pPr>
-        <w:rPr>
-          <w:i/>
-          <w:iCs/>
-        </w:rPr>
-      </w:pPr>
-      <w:r>
-        <w:rPr>
-          <w:i/>
-          <w:iCs/>
-        </w:rPr>
-        <w:t xml:space="preserve">" Of course, the party that is not in the White House maybe able to make a stronger case for change, but even the incumbent party—and </w:t>
-      </w:r>
-      <w:proofErr w:type="spellStart"/>
-      <w:r>
-        <w:rPr>
-          <w:i/>
-          <w:iCs/>
-        </w:rPr>
-        <w:t>theincumbent</w:t>
-      </w:r>
-      <w:proofErr w:type="spellEnd"/>
-      <w:r>
-        <w:rPr>
-          <w:i/>
-          <w:iCs/>
-        </w:rPr>
-        <w:t xml:space="preserve"> himself in 2004—used the strategy. </w:t>
-      </w:r>
-      <w:r>
-        <w:rPr>
-          <w:i/>
-          <w:iCs/>
-        </w:rPr>
-        <w:lastRenderedPageBreak/>
-        <w:t xml:space="preserve">Specifically, president George W. </w:t>
-      </w:r>
-      <w:proofErr w:type="spellStart"/>
-      <w:r>
-        <w:rPr>
-          <w:i/>
-          <w:iCs/>
-        </w:rPr>
-        <w:t>Bushran</w:t>
-      </w:r>
-      <w:proofErr w:type="spellEnd"/>
-      <w:r>
-        <w:rPr>
-          <w:i/>
-          <w:iCs/>
-        </w:rPr>
-        <w:t xml:space="preserve"> on a platform he said was well suited for “changing times” in a “changed </w:t>
-      </w:r>
-      <w:proofErr w:type="gramStart"/>
-      <w:r>
-        <w:rPr>
-          <w:i/>
-          <w:iCs/>
-        </w:rPr>
-        <w:t>world”(</w:t>
-      </w:r>
-      <w:proofErr w:type="gramEnd"/>
-      <w:r>
-        <w:rPr>
-          <w:i/>
-          <w:iCs/>
-        </w:rPr>
-        <w:t>Brownstein, 2004)." Levine et al. (2001)</w:t>
-      </w:r>
-    </w:p>
-    <w:p/>
-    <w:p>
-      <w:pPr>
-        <w:rPr>
-          <w:b/>
-          <w:bCs/>
-          <w:sz w:val="28"/>
-          <w:szCs w:val="28"/>
-        </w:rPr>
-      </w:pPr>
-    </w:p>
-    <w:p>
-      <w:pPr>
-        <w:jc w:val="center"/>
-        <w:rPr>
-          <w:b/>
-          <w:bCs/>
-          <w:sz w:val="28"/>
-          <w:szCs w:val="28"/>
-        </w:rPr>
-      </w:pPr>
-    </w:p>
-    <w:p>
-      <w:pPr>
-        <w:jc w:val="center"/>
-        <w:rPr>
-          <w:b/>
-          <w:bCs/>
-          <w:sz w:val="28"/>
-          <w:szCs w:val="28"/>
-        </w:rPr>
-      </w:pPr>
-    </w:p>
-    <w:p>
-      <w:pPr>
-        <w:jc w:val="center"/>
-        <w:rPr>
-          <w:b/>
-          <w:bCs/>
-          <w:sz w:val="28"/>
-          <w:szCs w:val="28"/>
-        </w:rPr>
-      </w:pPr>
-    </w:p>
-    <w:p>
-      <w:pPr>
-        <w:jc w:val="center"/>
-        <w:rPr>
-          <w:b/>
-          <w:bCs/>
-          <w:sz w:val="28"/>
-          <w:szCs w:val="28"/>
-        </w:rPr>
-      </w:pPr>
-    </w:p>
-    <w:p>
-      <w:pPr>
-        <w:jc w:val="center"/>
-        <w:rPr>
-          <w:b/>
-          <w:bCs/>
-          <w:sz w:val="28"/>
-          <w:szCs w:val="28"/>
-        </w:rPr>
-      </w:pPr>
-    </w:p>
-    <w:p>
-      <w:pPr>
-        <w:jc w:val="center"/>
-        <w:rPr>
-          <w:b/>
-          <w:bCs/>
-          <w:sz w:val="28"/>
-          <w:szCs w:val="28"/>
-        </w:rPr>
-      </w:pPr>
-    </w:p>
-    <w:p>
-      <w:pPr>
-        <w:jc w:val="center"/>
-        <w:rPr>
-          <w:b/>
-          <w:bCs/>
-          <w:sz w:val="28"/>
-          <w:szCs w:val="28"/>
-        </w:rPr>
-      </w:pPr>
-    </w:p>
-    <w:p>
-      <w:pPr>
-        <w:jc w:val="center"/>
-        <w:rPr>
-          <w:b/>
-          <w:bCs/>
-          <w:sz w:val="28"/>
-          <w:szCs w:val="28"/>
-        </w:rPr>
-      </w:pPr>
-    </w:p>
-    <w:p>
-      <w:pPr>
-        <w:jc w:val="center"/>
-        <w:rPr>
-          <w:b/>
-          <w:bCs/>
-          <w:sz w:val="28"/>
-          <w:szCs w:val="28"/>
-        </w:rPr>
-      </w:pPr>
-    </w:p>
-    <w:p>
-      <w:pPr>
-        <w:jc w:val="center"/>
-        <w:rPr>
-          <w:b/>
-          <w:bCs/>
-          <w:sz w:val="28"/>
-          <w:szCs w:val="28"/>
-        </w:rPr>
-      </w:pPr>
-    </w:p>
-    <w:p>
-      <w:pPr>
-        <w:jc w:val="center"/>
-        <w:rPr>
-          <w:b/>
-          <w:bCs/>
-          <w:sz w:val="28"/>
-          <w:szCs w:val="28"/>
-        </w:rPr>
-      </w:pPr>
+        <w:t>Weighted Sum</w:t>
+      </w:r>
+      <w:r>
+        <w:t xml:space="preserve"> = </w:t>
+      </w:r>
+      <m:oMath>
+        <m:nary>
+          <m:naryPr>
+            <m:chr m:val="∑"/>
+            <m:limLoc m:val="undOvr"/>
+            <m:ctrlPr>
+              <w:rPr>
+                <w:rFonts w:ascii="Cambria Math" w:hAnsi="Cambria Math"/>
+                <w:i/>
+              </w:rPr>
+            </m:ctrlPr>
+          </m:naryPr>
+          <m:sub>
+            <m:r>
+              <w:rPr>
+                <w:rFonts w:ascii="Cambria Math" w:hAnsi="Cambria Math"/>
+              </w:rPr>
+              <m:t>i=1</m:t>
+            </m:r>
+          </m:sub>
+          <m:sup>
+            <m:r>
+              <w:rPr>
+                <w:rFonts w:ascii="Cambria Math" w:hAnsi="Cambria Math"/>
+              </w:rPr>
+              <m:t>k</m:t>
+            </m:r>
+          </m:sup>
+          <m:e>
+            <m:r>
+              <w:rPr>
+                <w:rFonts w:ascii="Cambria Math" w:hAnsi="Cambria Math"/>
+              </w:rPr>
+              <m:t>(</m:t>
+            </m:r>
+            <m:sSub>
+              <m:sSubPr>
+                <m:ctrlPr>
+                  <w:rPr>
+                    <w:rFonts w:ascii="Cambria Math" w:hAnsi="Cambria Math"/>
+                    <w:i/>
+                  </w:rPr>
+                </m:ctrlPr>
+              </m:sSubPr>
+              <m:e>
+                <m:r>
+                  <w:rPr>
+                    <w:rFonts w:ascii="Cambria Math" w:hAnsi="Cambria Math"/>
+                  </w:rPr>
+                  <m:t>v</m:t>
+                </m:r>
+              </m:e>
+              <m:sub>
+                <m:r>
+                  <w:rPr>
+                    <w:rFonts w:ascii="Cambria Math" w:hAnsi="Cambria Math"/>
+                  </w:rPr>
+                  <m:t>i</m:t>
+                </m:r>
+              </m:sub>
+            </m:sSub>
+            <m:r>
+              <w:rPr>
+                <w:rFonts w:ascii="Cambria Math" w:hAnsi="Cambria Math"/>
+              </w:rPr>
+              <m:t>×</m:t>
+            </m:r>
+            <m:sSub>
+              <m:sSubPr>
+                <m:ctrlPr>
+                  <w:rPr>
+                    <w:rFonts w:ascii="Cambria Math" w:hAnsi="Cambria Math"/>
+                    <w:i/>
+                  </w:rPr>
+                </m:ctrlPr>
+              </m:sSubPr>
+              <m:e>
+                <m:r>
+                  <w:rPr>
+                    <w:rFonts w:ascii="Cambria Math" w:hAnsi="Cambria Math"/>
+                  </w:rPr>
+                  <m:t>w</m:t>
+                </m:r>
+              </m:e>
+              <m:sub>
+                <m:r>
+                  <w:rPr>
+                    <w:rFonts w:ascii="Cambria Math" w:hAnsi="Cambria Math"/>
+                  </w:rPr>
+                  <m:t>i</m:t>
+                </m:r>
+              </m:sub>
+            </m:sSub>
+            <m:r>
+              <w:rPr>
+                <w:rFonts w:ascii="Cambria Math" w:hAnsi="Cambria Math"/>
+              </w:rPr>
+              <m:t>)</m:t>
+            </m:r>
+          </m:e>
+        </m:nary>
+      </m:oMath>
+      <w:r>
+        <w:rPr>
+          <w:rFonts w:eastAsiaTheme="minorEastAsia"/>
+        </w:rPr>
+        <w:t>.</w:t>
+      </w:r>
     </w:p>
     <w:p>
       <w:pPr>

</xml_diff>